<commit_message>
new in the article after Fabian
</commit_message>
<xml_diff>
--- a/paper/What_is_worth_inheriting_v2.docx
+++ b/paper/What_is_worth_inheriting_v2.docx
@@ -49,23 +49,23 @@
         <w:spacing w:after="140" w:line="300"/>
       </w:pPr>
       <w:r>
-        <w:t xml:space="preserve">We describe a measurement platform. An individual object lives once, without replay. Losses accumulate as they occur. The object starts either from a generic default, from the record of one predecessor, or from a fund aggregated over many predecessors. The protocol was applied in three domains — a synthetic population of buildings, measured electricity records of 40 real non-residential buildings, and six benchmark water distribution networks — and to five candidate inherited objects.</w:t>
-      </w:r>
-    </w:p>
-    <w:p>
-      <w:pPr>
-        <w:spacing w:after="140" w:line="300"/>
-      </w:pPr>
-      <w:r>
-        <w:t xml:space="preserve">The paper is written as the chain of experiments in the order they were performed. It includes three defects of the instrument found after the experiments were finished, what each defect changed, and one reported figure that a controlled repetition did not support and which is withdrawn. Five results hold across domains. First, a complete inherited representation applied unchanged is usually worse than what the receiver can obtain for itself, even from two weeks of its own history. Second, similarity of bodies does not predict whether transfer helps; an apparent correlation of +0.21 in the first experiment turned out to be an artefact of the cost function and fell to +0.05 once the artefact was removed. Third, what transfers is the arrangement of observation, not the values: the rule for placing sensors transfers where the detection rule does not. Fourth, the quality a predecessor achieved does not pass to its successors; across two populations the slope of successor gain on predecessor quality was −2.12 and −0.38, negative in sign and undetermined in size. Fifth, most of the harm attributed to inheritance is an artefact of the units in which records are written; the same records expressed in quantities defined relative to the receiver raise the share of objects helped from 81–84 % to 99 %.</w:t>
-      </w:r>
-    </w:p>
-    <w:p>
-      <w:pPr>
-        <w:spacing w:after="140" w:line="300"/>
-      </w:pPr>
-      <w:r>
-        <w:t xml:space="preserve">A separate measurement bounds all of these. For each object we compute the best any schedule method could achieve, and find that four objects in five have almost nothing to gain while one in five has 11–41 %. What an object gains from the fund is closely related to how much it had to gain, with a correlation of +0.91, so the fund can be read as a ranking of which objects are worth attention — a question no object can answer about itself. We end with what the platform does not measure, including a measurement of its own range which shows that range to be narrow.</w:t>
+        <w:t xml:space="preserve">We describe a measurement platform. An individual object lives once, without replay. Losses accumulate as they occur. A target object starts either from a generic default (target-only), from the record of one source applied without adaptation (single-source, zero-shot), from an aggregate over many sources which we call a fund (multi-source), or from that fund followed by its own short adaptation (fine-tuned). The protocol was applied in three domains — a synthetic population of buildings, measured electricity records of 40 real non-residential buildings, and six benchmark water distribution networks — and to five candidate inherited objects.</w:t>
+      </w:r>
+    </w:p>
+    <w:p>
+      <w:pPr>
+        <w:spacing w:after="140" w:line="300"/>
+      </w:pPr>
+      <w:r>
+        <w:t xml:space="preserve">The paper is written as the chain of experiments in the order they were performed. It includes three defects of the instrument found after the experiments were finished, what each defect changed, and one reported figure that a controlled repetition did not support and which is withdrawn. Five results hold across domains. First, zero-shot transfer of a complete source representation is usually worse than what the target can obtain for itself, even from two weeks of its own history: negative transfer is the rule rather than the exception. Second, source selection by similarity of building characteristics does not work: no measure of similarity we tried predicts whether transfer helps; an apparent correlation of +0.21 in the first experiment turned out to be an artefact of the cost function and fell to +0.05 once the artefact was removed. Third, what transfers is the arrangement of observation, not the values: the rule for placing sensors transfers where the detection rule does not. Fourth, the quality a source achieved does not pass to its targets; across two populations the slope of target gain on source quality was −2.12 and −0.38, negative in sign and undetermined in size. Fifth, most of the negative transfer we measured is an artefact of feature representation rather than of transfer itself: a simple target-relative normalisation of the same records raises the share of objects helped from 81–84 % to 99 %.</w:t>
+      </w:r>
+    </w:p>
+    <w:p>
+      <w:pPr>
+        <w:spacing w:after="140" w:line="300"/>
+      </w:pPr>
+      <w:r>
+        <w:t xml:space="preserve">A separate measurement bounds all of these. For each object we compute an oracle baseline — the best any schedule method could achieve, and find that four objects in five have almost nothing to gain while one in five has 11–41 %. What an object gains from the fund is closely related to how much it had to gain, with a correlation of +0.91, so the fund can be read as a ranking of which objects are worth attention — a question no object can answer about itself. We end with what the platform does not measure, including a measurement of its own range which shows that range to be narrow.</w:t>
       </w:r>
     </w:p>
     <w:p>
@@ -82,7 +82,7 @@
         <w:spacing w:after="140" w:line="300"/>
       </w:pPr>
       <w:r>
-        <w:t xml:space="preserve">Technical objects that adapt during their operating life are now common. Buildings whose controls follow occupancy. Networks whose monitoring adjusts to observed failures. Fleets whose maintenance is revised as evidence accumulates. Each object acquires, over years, information specific to it and expensive to obtain. When it is decommissioned or rebuilt, that information is lost, and its successor starts from generic settings.</w:t>
+        <w:t xml:space="preserve">Technical objects that adapt during their operating life are now common. Buildings whose controls follow occupancy. Networks whose monitoring adjusts to observed failures. Fleets whose maintenance is revised as evidence accumulates. Each object acquires, over years, information specific to it and expensive to obtain. When it is decommissioned or rebuilt, that information is lost, and the building that replaces it starts from generic settings.</w:t>
       </w:r>
     </w:p>
     <w:p>
@@ -106,15 +106,23 @@
         <w:spacing w:after="140" w:line="300"/>
       </w:pPr>
       <w:r>
-        <w:t xml:space="preserve">The open question is prior to method. Given an object with an operating history, what part of that history is worth preserving so another object can use it? The answer is usually assumed rather than measured. In evolutionary robotics the inherited object is fixed in advance — a genotype, with lifetime learning written back into it [14]. In building control it is a set of controller parameters or a forecasting model. In each case the question of what to inherit has been settled before the experiment begins. We treat it as an empirical question and supply an apparatus.</w:t>
-      </w:r>
-    </w:p>
-    <w:p>
-      <w:pPr>
-        <w:spacing w:after="140" w:line="300"/>
-      </w:pPr>
-      <w:r>
-        <w:t xml:space="preserve">Two commitments shape the apparatus. An individual lives once. A building experiences each winter one time, cannot re-run it, and pays for mistakes in comfort and energy. Any protocol that lets the receiver replay its own life makes self-acquisition artificially cheap and inheritance artificially worthless. And the measured quantity is loss accumulated during the first life, not the quality of the final model, because the value of inherited experience is exactly the cost of acquiring it again.</w:t>
+        <w:t xml:space="preserve">Two threads in that literature bear directly on what follows. Negative transfer — a source that leaves the target worse off than no source at all — is recognised but not solved. And source selection — deciding which building to transfer from — is open. Most of what we report is a measurement of those two.</w:t>
+      </w:r>
+    </w:p>
+    <w:p>
+      <w:pPr>
+        <w:spacing w:after="140" w:line="300"/>
+      </w:pPr>
+      <w:r>
+        <w:t xml:space="preserve">The open question, though, is prior to method. Given an object with an operating history, what part of that history is worth preserving so another object can use it? The answer is usually assumed rather than measured. In evolutionary robotics the inherited object is fixed in advance — a genotype, with lifetime learning written back into it [14]. In building control it is a set of controller parameters or a forecasting model. In each case the question of what to inherit has been settled before the experiment begins. We treat it as an empirical question and supply an apparatus.</w:t>
+      </w:r>
+    </w:p>
+    <w:p>
+      <w:pPr>
+        <w:spacing w:after="140" w:line="300"/>
+      </w:pPr>
+      <w:r>
+        <w:t xml:space="preserve">Two commitments shape the apparatus. An individual lives once. A building experiences each winter one time, cannot re-run it, and pays for mistakes in comfort and energy. Any protocol that lets the target replay its own life makes self-acquisition artificially cheap and inheritance artificially worthless. And the measured quantity is loss accumulated during the first life, not the quality of the final model, because the value of inherited experience is exactly the cost of acquiring it again.</w:t>
       </w:r>
     </w:p>
     <w:p>
@@ -273,7 +281,7 @@
                 <w:sz w:val="18"/>
                 <w:szCs w:val="18"/>
               </w:rPr>
-              <w:t xml:space="preserve">Body</w:t>
+              <w:t xml:space="preserve">Characteristics (body)</w:t>
             </w:r>
           </w:p>
         </w:tc>
@@ -624,10 +632,10 @@
           <w:b/>
           <w:bCs/>
         </w:rPr>
-        <w:t xml:space="preserve">alone</w:t>
-      </w:r>
-      <w:r>
-        <w:t xml:space="preserve"> — the receiver starts from a generic default and learns only from its own single life;</w:t>
+        <w:t xml:space="preserve">target-only</w:t>
+      </w:r>
+      <w:r>
+        <w:t xml:space="preserve"> — the target starts from a generic default and learns only from its own single life; the baseline all other conditions are measured against;</w:t>
       </w:r>
     </w:p>
     <w:p>
@@ -644,10 +652,10 @@
           <w:b/>
           <w:bCs/>
         </w:rPr>
-        <w:t xml:space="preserve">one predecessor</w:t>
-      </w:r>
-      <w:r>
-        <w:t xml:space="preserve"> — the receiver starts from the record of a single earlier individual;</w:t>
+        <w:t xml:space="preserve">single-source, zero-shot</w:t>
+      </w:r>
+      <w:r>
+        <w:t xml:space="preserve"> — the target starts from the record of one earlier individual and does not adapt it;</w:t>
       </w:r>
     </w:p>
     <w:p>
@@ -664,10 +672,20 @@
           <w:b/>
           <w:bCs/>
         </w:rPr>
+        <w:t xml:space="preserve">multi-source, zero-shot</w:t>
+      </w:r>
+      <w:r>
+        <w:t xml:space="preserve"> — the target starts from an aggregate over many earlier records and does not adapt it. We call such an aggregate a </w:t>
+      </w:r>
+      <w:r>
+        <w:rPr>
+          <w:b/>
+          <w:bCs/>
+        </w:rPr>
         <w:t xml:space="preserve">fund</w:t>
       </w:r>
       <w:r>
-        <w:t xml:space="preserve"> — the receiver starts from an aggregate over many earlier records;</w:t>
+        <w:t xml:space="preserve"> and keep that word for it below;</w:t>
       </w:r>
     </w:p>
     <w:p>
@@ -684,18 +702,28 @@
           <w:b/>
           <w:bCs/>
         </w:rPr>
-        <w:t xml:space="preserve">fund, refined</w:t>
-      </w:r>
-      <w:r>
-        <w:t xml:space="preserve"> — the same, followed by the receiver's own short adaptation.</w:t>
-      </w:r>
-    </w:p>
-    <w:p>
-      <w:pPr>
-        <w:spacing w:after="140" w:line="300"/>
-      </w:pPr>
-      <w:r>
-        <w:t xml:space="preserve">Positive numbers mean the inherited start was better than starting alone. The protocol declares before each run what counts as confirmation and what as refutation. Negative outcomes are reported.</w:t>
+        <w:t xml:space="preserve">multi-source, fine-tuned</w:t>
+      </w:r>
+      <w:r>
+        <w:t xml:space="preserve"> — the same fund, followed by the target's own short adaptation.</w:t>
+      </w:r>
+    </w:p>
+    <w:p>
+      <w:pPr>
+        <w:spacing w:after="140" w:line="300"/>
+      </w:pPr>
+      <w:r>
+        <w:t xml:space="preserve">Positive numbers mean the inherited start was better than the target-only baseline; negative numbers are instances of </w:t>
+      </w:r>
+      <w:r>
+        <w:rPr>
+          <w:b/>
+          <w:bCs/>
+        </w:rPr>
+        <w:t xml:space="preserve">negative transfer</w:t>
+      </w:r>
+      <w:r>
+        <w:t xml:space="preserve">, and they are the majority of what we report. The protocol declares before each run what counts as confirmation and what as refutation. Negative outcomes are reported as they came.</w:t>
       </w:r>
     </w:p>
     <w:p>
@@ -712,7 +740,7 @@
         <w:spacing w:after="140" w:line="300"/>
       </w:pPr>
       <w:r>
-        <w:t xml:space="preserve">Ten synthetic buildings differ in ten parameters: envelope loss, thermal capacity, effective glazing, heating power, infiltration, internal gains, occupancy hour, mean outdoor temperature, daily swing, orientation. Each simulates a season of 60 days at hourly resolution. Cost combines energy and degree-hours of discomfort during occupancy. A controller is either five parameters — occupied setpoint, unoccupied setpoint, preheating lead, deadband, gain — or a schedule of 24 hourly setpoints. A donor has 400 evaluations of a season, a newcomer 40. Three populations give 270 ordered pairs per experiment.</w:t>
+        <w:t xml:space="preserve">Ten synthetic buildings differ in ten parameters: envelope loss, thermal capacity, effective glazing, heating power, infiltration, internal gains, occupancy hour, mean outdoor temperature, daily swing, orientation. Each simulates a season of 60 days at hourly resolution. Cost combines energy and degree-hours of discomfort during occupancy. A controller is either five parameters — occupied setpoint, unoccupied setpoint, preheating lead, deadband, gain — or a schedule of 24 hourly setpoints. A donor has 400 evaluations of a season, a target 40. Three populations give 270 ordered pairs per experiment.</w:t>
       </w:r>
     </w:p>
     <w:tbl>
@@ -940,7 +968,7 @@
                 <w:sz w:val="18"/>
                 <w:szCs w:val="18"/>
               </w:rPr>
-              <w:t xml:space="preserve">correlation of gain with body distance</w:t>
+              <w:t xml:space="preserve">correlation of gain with distance between building characteristics</w:t>
             </w:r>
           </w:p>
         </w:tc>
@@ -1003,7 +1031,7 @@
         <w:spacing w:after="140" w:line="300"/>
       </w:pPr>
       <w:r>
-        <w:t xml:space="preserve">Choosing the donor did not help. A linear rule predicting gain from per-parameter differences, fitted on two populations and tested on a third, gave +4.7 % against +4.1 % for a random donor. Choosing the nearest body by unweighted distance gave +3.5 %, worse than random. The best donor in hindsight gave +5.4 %.</w:t>
+        <w:t xml:space="preserve">Source selection did not help. A linear rule predicting gain from per-parameter differences, fitted on two populations and tested on a third, gave +4.7 % against +4.1 % for a randomly chosen source. Choosing the nearest building by unweighted distance gave +3.5 %, worse than random. The best source in hindsight gave +5.4 %.</w:t>
       </w:r>
     </w:p>
     <w:p>
@@ -1019,15 +1047,15 @@
         <w:spacing w:after="140" w:line="300"/>
       </w:pPr>
       <w:r>
-        <w:t xml:space="preserve">The comfort threshold was fixed at 21 °C and Step 1 was re-run on the same three populations. The main result survived: an inherited setting used whole is harmful, and the same setting used as a starting point helps. One thing changed. The correlation of gain with body distance fell from +0.21 to +0.05, that is to nothing. The only number in the original Step 1 that suggested body similarity might matter was produced by the moving threshold.</w:t>
-      </w:r>
-    </w:p>
-    <w:p>
-      <w:pPr>
-        <w:spacing w:after="140" w:line="300"/>
-      </w:pPr>
-      <w:r>
-        <w:t xml:space="preserve">There is a second, larger problem with Step 1, and it is not fixable by patching. A newcomer allowed 40 replays of the same season reaches most of what a donor reached in 400, because in this setting a season can be re-lived at no cost. No building can do this. The design was discarded.</w:t>
+        <w:t xml:space="preserve">The comfort threshold was fixed at 21 °C and Step 1 was re-run on the same three populations. The main result survived: an inherited setting used whole is harmful, and the same setting used as a starting point helps. One thing changed. The correlation of gain with distance between building characteristics fell from +0.21 to +0.05, that is to nothing. The only number in the original Step 1 that suggested similarity of characteristics might matter was produced by the moving threshold.</w:t>
+      </w:r>
+    </w:p>
+    <w:p>
+      <w:pPr>
+        <w:spacing w:after="140" w:line="300"/>
+      </w:pPr>
+      <w:r>
+        <w:t xml:space="preserve">There is a second, larger problem with Step 1, and it is not fixable by patching. A target allowed 40 replays of the same season reaches most of what a source reached in 400, because in this setting a season can be re-lived at no cost. No building can do this. The design was discarded.</w:t>
       </w:r>
     </w:p>
     <w:p>
@@ -1044,15 +1072,15 @@
         <w:spacing w:after="140" w:line="300"/>
       </w:pPr>
       <w:r>
-        <w:t xml:space="preserve">The protocol was rebuilt around a single life. Each building lives year after year in hourly simulation. Once a week it may try one modified schedule. The week is lived once, its cost is paid, and the modification is kept only if the week compared favourably with a regression of past weeks on mean outdoor temperature. Predecessors, having lived and kept a log, tune a schedule offline on their own record — the counterpart of an old building with years of data and a calibrated model. Newcomers begin from a generic 21 °C schedule, from a predecessor's tuned schedule, or from the median of ten such schedules.</w:t>
-      </w:r>
-    </w:p>
-    <w:p>
-      <w:pPr>
-        <w:spacing w:after="140" w:line="300"/>
-      </w:pPr>
-      <w:r>
-        <w:t xml:space="preserve">The experiment was run twice with one difference. In the first version the year is ordinary. In the second a rare condition may occur: a severe winter, a heat episode, or a heating plant at half capacity. Eight predecessors, ten newcomers, the same buildings and the same weather in both versions, the same tuning budget of sixty evaluations.</w:t>
+        <w:t xml:space="preserve">The protocol was rebuilt around a single life. Each building lives year after year in hourly simulation. Once a week it may try one modified schedule. The week is lived once, its cost is paid, and the modification is kept only if the week compared favourably with a regression of past weeks on mean outdoor temperature. Sources, having lived and kept a log, tune a schedule offline on their own record — the counterpart of an old building with years of data and a calibrated model. Targets begin from a generic 21 °C schedule, from a source's tuned schedule, or from the median of ten such schedules.</w:t>
+      </w:r>
+    </w:p>
+    <w:p>
+      <w:pPr>
+        <w:spacing w:after="140" w:line="300"/>
+      </w:pPr>
+      <w:r>
+        <w:t xml:space="preserve">The experiment was run twice with one difference. In the first version the year is ordinary. In the second a rare condition may occur: a severe winter, a heat episode, or a heating plant at half capacity. Eight sources, ten targets, the same buildings and the same weather in both versions, the same tuning budget of sixty evaluations.</w:t>
       </w:r>
     </w:p>
     <w:p>
@@ -1141,7 +1169,7 @@
                 <w:sz w:val="18"/>
                 <w:szCs w:val="18"/>
               </w:rPr>
-              <w:t xml:space="preserve">One predecessor</w:t>
+              <w:t xml:space="preserve">One source</w:t>
             </w:r>
           </w:p>
         </w:tc>
@@ -1161,7 +1189,7 @@
                 <w:sz w:val="18"/>
                 <w:szCs w:val="18"/>
               </w:rPr>
-              <w:t xml:space="preserve">Median over predecessors</w:t>
+              <w:t xml:space="preserve">Median over sources</w:t>
             </w:r>
           </w:p>
         </w:tc>
@@ -1502,23 +1530,23 @@
           <w:sz w:val="18"/>
           <w:szCs w:val="18"/>
         </w:rPr>
-        <w:t xml:space="preserve">Table 3. One pass through time. Ten newcomers per cell, identical buildings and weather across cells; only the year type and the integration step differ.</w:t>
-      </w:r>
-    </w:p>
-    <w:p>
-      <w:pPr>
-        <w:spacing w:after="140" w:line="300"/>
-      </w:pPr>
-      <w:r>
-        <w:t xml:space="preserve">Two things hold in every cell. An inherited schedule taken from a single predecessor is harmful. A median over many predecessors is not.</w:t>
-      </w:r>
-    </w:p>
-    <w:p>
-      <w:pPr>
-        <w:spacing w:after="140" w:line="300"/>
-      </w:pPr>
-      <w:r>
-        <w:t xml:space="preserve">Rare conditions sharpen the first of these and leave the second. A single predecessor goes from helping half the newcomers in an ordinary year to helping none at all when rare conditions are present, at both step sizes. It survived its own rare event, not the receiver's. The fund, which contains all the cases, helps 90 % and 100 % of newcomers in the two rare cells.</w:t>
+        <w:t xml:space="preserve">Table 3. One pass through time. Ten targets per cell, identical buildings and weather across cells; only the year type and the integration step differ.</w:t>
+      </w:r>
+    </w:p>
+    <w:p>
+      <w:pPr>
+        <w:spacing w:after="140" w:line="300"/>
+      </w:pPr>
+      <w:r>
+        <w:t xml:space="preserve">Two things hold in every cell. An inherited schedule taken from a single source is harmful. A median over many sources is not.</w:t>
+      </w:r>
+    </w:p>
+    <w:p>
+      <w:pPr>
+        <w:spacing w:after="140" w:line="300"/>
+      </w:pPr>
+      <w:r>
+        <w:t xml:space="preserve">Rare conditions sharpen the first of these and leave the second. A single source goes from helping half the targets in an ordinary year to helping none at all when rare conditions are present, at both step sizes. It survived its own rare event, not the target's. The fund, which contains all the cases, helps 90 % and 100 % of targets in the two rare cells.</w:t>
       </w:r>
     </w:p>
     <w:p>
@@ -1534,7 +1562,7 @@
         <w:spacing w:after="140" w:line="300"/>
       </w:pPr>
       <w:r>
-        <w:t xml:space="preserve">Ten newcomers per cell. The ordering is consistent across four cells; the magnitudes are not established.</w:t>
+        <w:t xml:space="preserve">Ten targets per cell. The ordering is consistent across four cells; the magnitudes are not established.</w:t>
       </w:r>
     </w:p>
     <w:p>
@@ -1551,7 +1579,7 @@
         <w:spacing w:after="140" w:line="300"/>
       </w:pPr>
       <w:r>
-        <w:t xml:space="preserve">The Building Data Genome Project 2 [4] provides hourly electricity for 1 636 non-residential buildings over 2016–2017, with weather and metadata. We use site "Rat": 40 buildings with at least 95 % coverage. Each building's load shape — consumption divided by its own mean — is predicted from hour, day of week, month, weekend, outdoor temperature and its lag. Models are gradient-boosted. 2016 trains, 2017 tests. A newcomer is a building for which only the first 14 days of 2016 exist. 1 560 ordered pairs.</w:t>
+        <w:t xml:space="preserve">The Building Data Genome Project 2 [4] provides hourly electricity for 1 636 non-residential buildings over 2016–2017, with weather and metadata. We use site "Rat": 40 buildings with at least 95 % coverage. Each building's load shape — consumption divided by its own mean — is predicted from hour, day of week, month, weekend, outdoor temperature and its lag. Models are gradient-boosted. 2016 trains, 2017 tests. A target is a building for which only the first 14 days of 2016 exist. 1 560 ordered pairs.</w:t>
       </w:r>
     </w:p>
     <w:tbl>
@@ -1655,7 +1683,7 @@
                 <w:sz w:val="18"/>
                 <w:szCs w:val="18"/>
               </w:rPr>
-              <w:t xml:space="preserve">a donor's full model, receiver has full history</w:t>
+              <w:t xml:space="preserve">a source's full model, target has full history</w:t>
             </w:r>
           </w:p>
         </w:tc>
@@ -1717,7 +1745,7 @@
                 <w:sz w:val="18"/>
                 <w:szCs w:val="18"/>
               </w:rPr>
-              <w:t xml:space="preserve">a donor's model as is, receiver has 14 days</w:t>
+              <w:t xml:space="preserve">a source's model, zero-shot, target has 14 days</w:t>
             </w:r>
           </w:p>
         </w:tc>
@@ -1779,7 +1807,7 @@
                 <w:sz w:val="18"/>
                 <w:szCs w:val="18"/>
               </w:rPr>
-              <w:t xml:space="preserve">a donor's model refined on 14 days</w:t>
+              <w:t xml:space="preserve">a source's model fine-tuned on 14 days</w:t>
             </w:r>
           </w:p>
         </w:tc>
@@ -1841,7 +1869,7 @@
                 <w:sz w:val="18"/>
                 <w:szCs w:val="18"/>
               </w:rPr>
-              <w:t xml:space="preserve">best donor in hindsight</w:t>
+              <w:t xml:space="preserve">best source in hindsight</w:t>
             </w:r>
           </w:p>
         </w:tc>
@@ -2020,15 +2048,15 @@
           <w:sz w:val="18"/>
           <w:szCs w:val="18"/>
         </w:rPr>
-        <w:t xml:space="preserve">Table 4. Measured buildings. Change relative to the receiver's own model, 1 560 ordered pairs.</w:t>
-      </w:r>
-    </w:p>
-    <w:p>
-      <w:pPr>
-        <w:spacing w:after="140" w:line="300"/>
-      </w:pPr>
-      <w:r>
-        <w:t xml:space="preserve">The ordering of Step 2 reappears on measured data, and it is sharper. A whole inherited representation loses 85 % of accuracy, against roughly 10 % in simulation. Population knowledge combined with the receiver's own short history is again the only condition that helps a majority.</w:t>
+        <w:t xml:space="preserve">Table 4. Measured buildings. Change relative to the target's own model, 1 560 ordered pairs.</w:t>
+      </w:r>
+    </w:p>
+    <w:p>
+      <w:pPr>
+        <w:spacing w:after="140" w:line="300"/>
+      </w:pPr>
+      <w:r>
+        <w:t xml:space="preserve">The ordering of Step 2 reappears on measured data, and it is sharper. A whole inherited representation loses 85 % of accuracy, against roughly 10 % in simulation. Population knowledge combined with the target's own short history is again the only condition that helps a majority.</w:t>
       </w:r>
     </w:p>
     <w:p>
@@ -2053,7 +2081,7 @@
         <w:spacing w:after="140" w:before="320"/>
       </w:pPr>
       <w:r>
-        <w:t xml:space="preserve">6. Step 4: a domain whose body is a graph</w:t>
+        <w:t xml:space="preserve">6. Step 4: a domain whose building characteristics are a graph</w:t>
       </w:r>
     </w:p>
     <w:p>
@@ -2139,7 +2167,7 @@
                 <w:sz w:val="18"/>
                 <w:szCs w:val="18"/>
               </w:rPr>
-              <w:t xml:space="preserve">Own rule, 1 failure</w:t>
+              <w:t xml:space="preserve">Target-only, 1 failure</w:t>
             </w:r>
           </w:p>
         </w:tc>
@@ -2159,7 +2187,7 @@
                 <w:sz w:val="18"/>
                 <w:szCs w:val="18"/>
               </w:rPr>
-              <w:t xml:space="preserve">One donor's rule</w:t>
+              <w:t xml:space="preserve">Single-source, zero-shot</w:t>
             </w:r>
           </w:p>
         </w:tc>
@@ -2179,7 +2207,7 @@
                 <w:sz w:val="18"/>
                 <w:szCs w:val="18"/>
               </w:rPr>
-              <w:t xml:space="preserve">Fund, refined</w:t>
+              <w:t xml:space="preserve">Multi-source, fine-tuned</w:t>
             </w:r>
           </w:p>
         </w:tc>
@@ -2690,7 +2718,7 @@
         <w:spacing w:after="140" w:line="300"/>
       </w:pPr>
       <w:r>
-        <w:t xml:space="preserve">A single failure suffices. The newcomer reaches 0.99 of 1.0 from one leak, and there is nothing left to inherit. Anytown shows the risk instead: a donor's rule gives 0.312 where the network's own rule gives 0.987.</w:t>
+        <w:t xml:space="preserve">A single failure suffices. The target reaches 0.99 of 1.0 from one leak, and there is nothing left to inherit. Anytown shows the risk instead: a source's rule gives 0.312 where the network's own rule gives 0.987.</w:t>
       </w:r>
     </w:p>
     <w:p>
@@ -2789,7 +2817,7 @@
                 <w:sz w:val="18"/>
                 <w:szCs w:val="18"/>
               </w:rPr>
-              <w:t xml:space="preserve">Own rule, 2 failures</w:t>
+              <w:t xml:space="preserve">Target-only, 2 failures</w:t>
             </w:r>
           </w:p>
         </w:tc>
@@ -2809,7 +2837,7 @@
                 <w:sz w:val="18"/>
                 <w:szCs w:val="18"/>
               </w:rPr>
-              <w:t xml:space="preserve">One donor</w:t>
+              <w:t xml:space="preserve">Single-source</w:t>
             </w:r>
           </w:p>
         </w:tc>
@@ -2829,7 +2857,7 @@
                 <w:sz w:val="18"/>
                 <w:szCs w:val="18"/>
               </w:rPr>
-              <w:t xml:space="preserve">Fund</w:t>
+              <w:t xml:space="preserve">Multi-source</w:t>
             </w:r>
           </w:p>
         </w:tc>
@@ -3968,7 +3996,7 @@
                 <w:sz w:val="18"/>
                 <w:szCs w:val="18"/>
               </w:rPr>
-              <w:t xml:space="preserve">Condition of the receiving object</w:t>
+              <w:t xml:space="preserve">Condition of the target object</w:t>
             </w:r>
           </w:p>
         </w:tc>
@@ -4490,23 +4518,23 @@
         <w:spacing w:after="140" w:before="320"/>
       </w:pPr>
       <w:r>
-        <w:t xml:space="preserve">8. Step 6: the language in which records are written</w:t>
-      </w:r>
-    </w:p>
-    <w:p>
-      <w:pPr>
-        <w:spacing w:after="140" w:line="300"/>
-      </w:pPr>
-      <w:r>
-        <w:t xml:space="preserve">All transfers so far moved a schedule expressed in degrees. A schedule in degrees is meaningful only relative to a particular body. The same 18 °C night setpoint is a mild setback in one building and an unreachable target in another.</w:t>
-      </w:r>
-    </w:p>
-    <w:p>
-      <w:pPr>
-        <w:spacing w:after="140" w:line="300"/>
-      </w:pPr>
-      <w:r>
-        <w:t xml:space="preserve">We re-expressed the identical records in four dimensionless quantities defined relative to the receiving object: the depth of setback below its own comfort temperature, the lead time before its own occupancy hour, any daytime reduction, and the duration of the reduced period. A schedule for any object is reconstructed from these four numbers.</w:t>
+        <w:t xml:space="preserve">8. Step 6: feature representation, or the language in which records are written</w:t>
+      </w:r>
+    </w:p>
+    <w:p>
+      <w:pPr>
+        <w:spacing w:after="140" w:line="300"/>
+      </w:pPr>
+      <w:r>
+        <w:t xml:space="preserve">All transfers so far moved a schedule expressed in degrees. A schedule in degrees is meaningful only relative to a particular building. The same 18 °C night setpoint is a mild setback in one building and an unreachable target in another. In the vocabulary of the field this is a feature representation problem, and what follows is a simple form of domain adaptation: target-relative feature normalisation.</w:t>
+      </w:r>
+    </w:p>
+    <w:p>
+      <w:pPr>
+        <w:spacing w:after="140" w:line="300"/>
+      </w:pPr>
+      <w:r>
+        <w:t xml:space="preserve">We re-expressed the identical records in four dimensionless quantities defined relative to the target object: the depth of setback below its own comfort temperature, the lead time before its own occupancy hour, any daytime reduction, and the duration of the reduced period. A schedule for any object is reconstructed from these four numbers. Nothing about the transfer method changes; only the space the records live in.</w:t>
       </w:r>
     </w:p>
     <w:tbl>
@@ -4983,15 +5011,15 @@
         <w:spacing w:after="140" w:line="300"/>
       </w:pPr>
       <w:r>
-        <w:t xml:space="preserve">The median gain rises by about half. The decisive figure is the share of objects helped: 99 % against 83–84 %. Most of the harm previously attributed to inheritance was an effect of representation. A record written in quantities that refer to the receiver almost never damages it.</w:t>
-      </w:r>
-    </w:p>
-    <w:p>
-      <w:pPr>
-        <w:spacing w:after="140" w:line="300"/>
-      </w:pPr>
-      <w:r>
-        <w:t xml:space="preserve">The same experiment measures the distance from each newcomer to the nearest record in the fund. Gain falls as the distance grows, from +4.1 % to +1.8 % in degrees, and falls more gently in the dimensionless form, from +5.6 % to +3.6 %. A common language is needed exactly where no similar case exists.</w:t>
+        <w:t xml:space="preserve">The median gain rises by about half. The decisive figure is the share of objects helped: 99 % against 83–84 %. Most of the harm previously attributed to inheritance was an effect of representation. A record written in quantities that refer to the target almost never damages it.</w:t>
+      </w:r>
+    </w:p>
+    <w:p>
+      <w:pPr>
+        <w:spacing w:after="140" w:line="300"/>
+      </w:pPr>
+      <w:r>
+        <w:t xml:space="preserve">The same experiment measures the distance from each target to the nearest record in the fund. Gain falls as the distance grows, from +4.1 % to +1.8 % in degrees, and falls more gently in the dimensionless form, from +5.6 % to +3.6 %. A common language is needed exactly where no similar case exists.</w:t>
       </w:r>
     </w:p>
     <w:p>
@@ -5016,15 +5044,15 @@
         <w:spacing w:after="140" w:line="300"/>
       </w:pPr>
       <w:r>
-        <w:t xml:space="preserve">Every experiment so far asked whether a fund helps. This one asks a different question. If a predecessor tuned itself well, do its successors do better than the successors of a mediocre predecessor?</w:t>
-      </w:r>
-    </w:p>
-    <w:p>
-      <w:pPr>
-        <w:spacing w:after="140" w:line="300"/>
-      </w:pPr>
-      <w:r>
-        <w:t xml:space="preserve">Twelve predecessors tune themselves offline. Each contributes five successors. We measure the slope of successor gain on predecessor quality. A slope of 1.0 would mean that every percentage point won by the predecessor passes to the successor. Two independent populations.</w:t>
+        <w:t xml:space="preserve">Every experiment so far asked whether a fund helps. This one asks a different question. If a source tuned itself well, do its targets do better than the targets of a mediocre source?</w:t>
+      </w:r>
+    </w:p>
+    <w:p>
+      <w:pPr>
+        <w:spacing w:after="140" w:line="300"/>
+      </w:pPr>
+      <w:r>
+        <w:t xml:space="preserve">Twelve sources tune themselves offline. Each contributes five targets. We measure the slope of target gain on source quality. A slope of 1.0 would mean that every percentage point won by the source passes to the target. Two independent populations.</w:t>
       </w:r>
     </w:p>
     <w:tbl>
@@ -5128,7 +5156,7 @@
                 <w:sz w:val="18"/>
                 <w:szCs w:val="18"/>
               </w:rPr>
-              <w:t xml:space="preserve">predecessor quality, mean</w:t>
+              <w:t xml:space="preserve">source quality, mean</w:t>
             </w:r>
           </w:p>
         </w:tc>
@@ -5190,7 +5218,7 @@
                 <w:sz w:val="18"/>
                 <w:szCs w:val="18"/>
               </w:rPr>
-              <w:t xml:space="preserve">predecessor quality, spread</w:t>
+              <w:t xml:space="preserve">source quality, spread</w:t>
             </w:r>
           </w:p>
         </w:tc>
@@ -5252,7 +5280,7 @@
                 <w:sz w:val="18"/>
                 <w:szCs w:val="18"/>
               </w:rPr>
-              <w:t xml:space="preserve">successor gain from one predecessor</w:t>
+              <w:t xml:space="preserve">target gain from one source</w:t>
             </w:r>
           </w:p>
         </w:tc>
@@ -5314,7 +5342,7 @@
                 <w:sz w:val="18"/>
                 <w:szCs w:val="18"/>
               </w:rPr>
-              <w:t xml:space="preserve">successor gain from the fund</w:t>
+              <w:t xml:space="preserve">target gain from the fund</w:t>
             </w:r>
           </w:p>
         </w:tc>
@@ -5493,23 +5521,23 @@
           <w:sz w:val="18"/>
           <w:szCs w:val="18"/>
         </w:rPr>
-        <w:t xml:space="preserve">Table 10. Heritability of quality. Twelve predecessors, five successors each, two populations.</w:t>
-      </w:r>
-    </w:p>
-    <w:p>
-      <w:pPr>
-        <w:spacing w:after="140" w:line="300"/>
-      </w:pPr>
-      <w:r>
-        <w:t xml:space="preserve">The slope is negative in both populations. Its size differs by a factor of five, and at sixty points neither correlation is distinguishable from zero. The statement that survives is that predecessor quality does not predict successor gain. The statement that does not survive is that a good predecessor is harmful, which is what −2.12 alone appeared to say.</w:t>
-      </w:r>
-    </w:p>
-    <w:p>
-      <w:pPr>
-        <w:spacing w:after="140" w:line="300"/>
-      </w:pPr>
-      <w:r>
-        <w:t xml:space="preserve">This explains why a fund works and a single predecessor does not. If quality were heritable, finding the best predecessor would be enough. One predecessor helps roughly half of successors regardless of how good it is. A fund helps 97–98 %, and not because it contains good predecessors but because it contains many different cases.</w:t>
+        <w:t xml:space="preserve">Table 10. Heritability of quality. Twelve sources, five targets each, two populations.</w:t>
+      </w:r>
+    </w:p>
+    <w:p>
+      <w:pPr>
+        <w:spacing w:after="140" w:line="300"/>
+      </w:pPr>
+      <w:r>
+        <w:t xml:space="preserve">The slope is negative in both populations. Its size differs by a factor of five, and at sixty points neither correlation is distinguishable from zero. The statement that survives is that source quality does not predict target gain. The statement that does not survive is that a good source is harmful, which is what −2.12 alone appeared to say.</w:t>
+      </w:r>
+    </w:p>
+    <w:p>
+      <w:pPr>
+        <w:spacing w:after="140" w:line="300"/>
+      </w:pPr>
+      <w:r>
+        <w:t xml:space="preserve">This explains why a fund works and a single source does not. If quality were heritable, finding the best source would be enough. One source helps roughly half of targets regardless of how good it is. A fund helps 97–98 %, and not because it contains good sources but because it contains many different cases.</w:t>
       </w:r>
     </w:p>
     <w:p>
@@ -5654,7 +5682,7 @@
         <w:spacing w:after="140" w:line="300"/>
       </w:pPr>
       <w:r>
-        <w:t xml:space="preserve">A separate measurement bounds everything above. For each building we searched for the cheapest schedule using 400 evaluations of its own year with full knowledge of that year in advance, and compared it with an untouched 21 °C schedule. No method that changes only the schedule can beat this number: not self-learning, not a fund, not an engineer.</w:t>
+        <w:t xml:space="preserve">A separate measurement bounds everything above: an oracle baseline. For each building we searched for the cheapest schedule using 400 evaluations of its own year with full knowledge of that year in advance, and compared it with an untouched 21 °C schedule. No method that changes only the schedule can beat this number: not self-learning, not a fund, not an engineer.</w:t>
       </w:r>
     </w:p>
     <w:tbl>
@@ -5986,7 +6014,7 @@
         <w:spacing w:after="140" w:line="300"/>
       </w:pPr>
       <w:r>
-        <w:t xml:space="preserve">The second of these was tested directly. Fifteen predecessors in each of two populations contribute records; the median of those records is the fund. Twenty newcomers, none of them in the fund, each receive the fund and forty of their own evaluations. Their gain is compared with their own ceiling, measured separately.</w:t>
+        <w:t xml:space="preserve">The second of these was tested directly. Fifteen sources in each of two populations contribute records; the median of those records is the fund. Twenty targets, none of them in the fund, each receive the fund and forty of their own evaluations. Their gain is compared with their own ceiling, measured separately.</w:t>
       </w:r>
     </w:p>
     <w:tbl>
@@ -6045,7 +6073,7 @@
                 <w:sz w:val="18"/>
                 <w:szCs w:val="18"/>
               </w:rPr>
-              <w:t xml:space="preserve">Across 20 newcomers</w:t>
+              <w:t xml:space="preserve">Across 20 targets</w:t>
             </w:r>
           </w:p>
         </w:tc>
@@ -6250,23 +6278,23 @@
         <w:spacing w:after="140" w:line="300"/>
       </w:pPr>
       <w:r>
-        <w:t xml:space="preserve">Two groups separate. In the nine newcomers whose ceiling exceeds 5 %, the ceiling has a median of 7.5 % and the fund with refinement returns 4.3 %. In the eleven below 5 %, the ceiling is 1.1 % and the fund returns 0.2 %. In the two largest cases the fund recovered 74 % and 53 % of what was available.</w:t>
-      </w:r>
-    </w:p>
-    <w:p>
-      <w:pPr>
-        <w:spacing w:after="140" w:line="300"/>
-      </w:pPr>
-      <w:r>
-        <w:t xml:space="preserve">The correlation of +0.91 is the point. A building's gain from the fund tracks how much that building had to gain. So the fund can be read as a filter. Ranking the twenty newcomers by their gain and taking the first five captures 77 % of all the gain available in the population; five buildings chosen at random capture 30 %.</w:t>
-      </w:r>
-    </w:p>
-    <w:p>
-      <w:pPr>
-        <w:spacing w:after="140" w:line="300"/>
-      </w:pPr>
-      <w:r>
-        <w:t xml:space="preserve">Twenty newcomers in two populations is a small sample and the correlation is measured within one synthetic domain. But the mechanism does not depend on the domain. A fund answers a question no individual can answer about itself, and the cheapest useful form of that answer is a ranking: which objects are worth visiting, and which are already close to their own limit.</w:t>
+        <w:t xml:space="preserve">Two groups separate. In the nine targets whose ceiling exceeds 5 %, the ceiling has a median of 7.5 % and the fund with refinement returns 4.3 %. In the eleven below 5 %, the ceiling is 1.1 % and the fund returns 0.2 %. In the two largest cases the fund recovered 74 % and 53 % of what was available.</w:t>
+      </w:r>
+    </w:p>
+    <w:p>
+      <w:pPr>
+        <w:spacing w:after="140" w:line="300"/>
+      </w:pPr>
+      <w:r>
+        <w:t xml:space="preserve">The correlation of +0.91 is the point. A building's gain from the fund tracks how much that building had to gain. So the fund can be read as a filter. Ranking the twenty targets by their gain and taking the first five captures 77 % of all the gain available in the population; five buildings chosen at random capture 30 %.</w:t>
+      </w:r>
+    </w:p>
+    <w:p>
+      <w:pPr>
+        <w:spacing w:after="140" w:line="300"/>
+      </w:pPr>
+      <w:r>
+        <w:t xml:space="preserve">Twenty targets in two populations is a small sample and the correlation is measured within one synthetic domain. But the mechanism does not depend on the domain. A fund answers a question no individual can answer about itself, and the cheapest useful form of that answer is a ranking: which objects are worth visiting, and which are already close to their own limit.</w:t>
       </w:r>
     </w:p>
     <w:p>
@@ -6317,7 +6345,7 @@
         <w:spacing w:after="80"/>
       </w:pPr>
       <w:r>
-        <w:t xml:space="preserve">A single predecessor is unreliable and cannot be chosen in advance by any obvious measure of similarity, including physical parameters, floor area, year and declared use.</w:t>
+        <w:t xml:space="preserve">A single source is unreliable and cannot be chosen in advance by any obvious measure of similarity, including physical parameters, floor area, year and declared use.</w:t>
       </w:r>
     </w:p>
     <w:p>
@@ -6330,7 +6358,7 @@
         <w:spacing w:after="80"/>
       </w:pPr>
       <w:r>
-        <w:t xml:space="preserve">The quality a predecessor achieved does not pass to its successors.</w:t>
+        <w:t xml:space="preserve">The quality a source achieved does not pass to its targets.</w:t>
       </w:r>
     </w:p>
     <w:p>
@@ -6356,7 +6384,7 @@
         <w:spacing w:after="80"/>
       </w:pPr>
       <w:r>
-        <w:t xml:space="preserve">Inheritance from a single predecessor becomes actively harmful where the event is rare: in an ordinary year such a predecessor helps about half of newcomers, and when rare conditions are present it helps none, at both integration steps (§4). Where many events are needed before an object can judge at all, an inherited rule is the only source available (§6.2).</w:t>
+        <w:t xml:space="preserve">Inheritance from a single source becomes actively harmful where the event is rare: in an ordinary year such a source helps about half of targets, and when rare conditions are present it helps none, at both integration steps (§4). Where many events are needed before an object can judge at all, an inherited rule is the only source available (§6.2).</w:t>
       </w:r>
     </w:p>
     <w:p>
@@ -6395,7 +6423,7 @@
         <w:spacing w:after="80"/>
       </w:pPr>
       <w:r>
-        <w:t xml:space="preserve">Representation dominates. The same records expressed relative to the receiver almost cease to do harm.</w:t>
+        <w:t xml:space="preserve">Representation dominates. The same records expressed relative to the target almost cease to do harm.</w:t>
       </w:r>
     </w:p>
     <w:p>
@@ -6416,7 +6444,7 @@
         <w:spacing w:after="140" w:line="300"/>
       </w:pPr>
       <w:r>
-        <w:t xml:space="preserve">For the general question the results give one working answer: what is worth inheriting is what is expensive to acquire again, written in terms that refer to the receiver rather than to the donor.</w:t>
+        <w:t xml:space="preserve">For the general question the results give one working answer: what is worth inheriting is what is expensive to acquire again, written in terms that refer to the target rather than to the source.</w:t>
       </w:r>
     </w:p>
     <w:p>
@@ -6477,7 +6505,7 @@
         <w:spacing w:after="80"/>
       </w:pPr>
       <w:r>
-        <w:t xml:space="preserve">Cost weights, the ranges of body parameters and the frequency of rare conditions are choices of the author. With different choices the magnitudes, though probably not the ordering, would change.</w:t>
+        <w:t xml:space="preserve">Cost weights, the ranges of building parameters and the frequency of rare conditions are choices of the author. With different choices the magnitudes, though probably not the ordering, would change.</w:t>
       </w:r>
     </w:p>
     <w:p>
@@ -6516,7 +6544,7 @@
         <w:spacing w:after="80"/>
       </w:pPr>
       <w:r>
-        <w:t xml:space="preserve">The ranking result of §11.1 rests on twenty newcomers in one synthetic domain and has not been tested on measured data.</w:t>
+        <w:t xml:space="preserve">The ranking result of §11.1 rests on twenty targets in one synthetic domain and has not been tested on measured data.</w:t>
       </w:r>
     </w:p>
     <w:p>

</xml_diff>